<commit_message>
Added write-up for lesson four
</commit_message>
<xml_diff>
--- a/Electrical/SiteExperience/Fourth Mon 17-11-25/Write-up/Write-up17_11_2025.docx
+++ b/Electrical/SiteExperience/Fourth Mon 17-11-25/Write-up/Write-up17_11_2025.docx
@@ -34,7 +34,7 @@
     </w:p>
     <w:sdt>
       <w:sdtPr>
-        <w:id w:val="-907516854"/>
+        <w:id w:val="-1407016388"/>
         <w:docPartObj>
           <w:docPartGallery w:val="Table of Contents"/>
           <w:docPartUnique w:val="1"/>
@@ -510,12 +510,12 @@
           <wp:inline distB="114300" distT="114300" distL="114300" distR="114300">
             <wp:extent cx="3612722" cy="6472238"/>
             <wp:effectExtent b="101600" l="101600" r="101600" t="101600"/>
-            <wp:docPr id="1" name="image2.jpg"/>
+            <wp:docPr id="3" name="image5.jpg"/>
             <a:graphic>
               <a:graphicData uri="http://schemas.openxmlformats.org/drawingml/2006/picture">
                 <pic:pic>
                   <pic:nvPicPr>
-                    <pic:cNvPr id="0" name="image2.jpg"/>
+                    <pic:cNvPr id="0" name="image5.jpg"/>
                     <pic:cNvPicPr preferRelativeResize="0"/>
                   </pic:nvPicPr>
                   <pic:blipFill>
@@ -597,7 +597,7 @@
           <w:highlight w:val="white"/>
           <w:rtl w:val="0"/>
         </w:rPr>
-        <w:t xml:space="preserve">While the metal back box was in the cut out I marked with a pen where the screws were going to be inserted. I then drill into the brickwall and put wall socket plugs into the insertions. I put back the metal back box and screwed  two screws firmly into the wall plugs. This tightened the double socket to the brickwork. </w:t>
+        <w:t xml:space="preserve">While the metal back box was in the cut out. I marked with a sharpie pen where the holes were against the brickwall. I then drill into the brickwall and put wall socket plugs into the insertions. I put back the metal back box and screwed  two screws firmly into the wall plugs. This tightened the double socket to the brickwork. </w:t>
       </w:r>
     </w:p>
     <w:p>
@@ -633,6 +633,233 @@
           <w:rtl w:val="0"/>
         </w:rPr>
         <w:t xml:space="preserve">Another challenge that I encountered was with the double socket. The holes in the double socket back box had been worn out. This meant I faced difficulty when I tried to secure the socket front to the socket back box through the socket pins. My electrical supervisor used a re-threader tool to re-define the holes in the socket box. In addition, he used a snip tool with a screw cut feature to shorten the length. </w:t>
+        <w:br w:type="textWrapping"/>
+        <w:br w:type="textWrapping"/>
+      </w:r>
+      <w:r>
+        <w:rPr>
+          <w:rFonts w:ascii="EB Garamond" w:cs="EB Garamond" w:eastAsia="EB Garamond" w:hAnsi="EB Garamond"/>
+          <w:sz w:val="28"/>
+          <w:szCs w:val="28"/>
+          <w:highlight w:val="white"/>
+        </w:rPr>
+        <w:drawing>
+          <wp:inline distB="114300" distT="114300" distL="114300" distR="114300">
+            <wp:extent cx="4433888" cy="2275866"/>
+            <wp:effectExtent b="101600" l="101600" r="101600" t="101600"/>
+            <wp:docPr id="1" name="image3.png"/>
+            <a:graphic>
+              <a:graphicData uri="http://schemas.openxmlformats.org/drawingml/2006/picture">
+                <pic:pic>
+                  <pic:nvPicPr>
+                    <pic:cNvPr id="0" name="image3.png"/>
+                    <pic:cNvPicPr preferRelativeResize="0"/>
+                  </pic:nvPicPr>
+                  <pic:blipFill>
+                    <a:blip r:embed="rId7"/>
+                    <a:srcRect b="0" l="0" r="0" t="0"/>
+                    <a:stretch>
+                      <a:fillRect/>
+                    </a:stretch>
+                  </pic:blipFill>
+                  <pic:spPr>
+                    <a:xfrm>
+                      <a:off x="0" y="0"/>
+                      <a:ext cx="4433888" cy="2275866"/>
+                    </a:xfrm>
+                    <a:prstGeom prst="rect"/>
+                    <a:ln w="101600">
+                      <a:solidFill>
+                        <a:srgbClr val="000000"/>
+                      </a:solidFill>
+                      <a:prstDash val="solid"/>
+                    </a:ln>
+                  </pic:spPr>
+                </pic:pic>
+              </a:graphicData>
+            </a:graphic>
+          </wp:inline>
+        </w:drawing>
+      </w:r>
+      <w:r>
+        <w:rPr>
+          <w:rtl w:val="0"/>
+        </w:rPr>
+      </w:r>
+    </w:p>
+    <w:p>
+      <w:pPr>
+        <w:rPr>
+          <w:rFonts w:ascii="EB Garamond" w:cs="EB Garamond" w:eastAsia="EB Garamond" w:hAnsi="EB Garamond"/>
+          <w:sz w:val="28"/>
+          <w:szCs w:val="28"/>
+          <w:highlight w:val="white"/>
+        </w:rPr>
+      </w:pPr>
+      <w:r>
+        <w:rPr>
+          <w:rtl w:val="0"/>
+        </w:rPr>
+      </w:r>
+    </w:p>
+    <w:p>
+      <w:pPr>
+        <w:rPr>
+          <w:rFonts w:ascii="EB Garamond" w:cs="EB Garamond" w:eastAsia="EB Garamond" w:hAnsi="EB Garamond"/>
+          <w:sz w:val="28"/>
+          <w:szCs w:val="28"/>
+          <w:highlight w:val="white"/>
+        </w:rPr>
+      </w:pPr>
+      <w:r>
+        <w:rPr>
+          <w:rFonts w:ascii="EB Garamond" w:cs="EB Garamond" w:eastAsia="EB Garamond" w:hAnsi="EB Garamond"/>
+          <w:sz w:val="28"/>
+          <w:szCs w:val="28"/>
+          <w:highlight w:val="white"/>
+          <w:rtl w:val="0"/>
+        </w:rPr>
+        <w:t xml:space="preserve">This was a significant part of the day and without the re-threader I would have been in despair. Also I gained a small amount of comprehension in relation to radial circuits as well because I could envision that circuit behind the plasterboard and how all components were connected.</w:t>
+      </w:r>
+    </w:p>
+    <w:p>
+      <w:pPr>
+        <w:rPr>
+          <w:rFonts w:ascii="EB Garamond" w:cs="EB Garamond" w:eastAsia="EB Garamond" w:hAnsi="EB Garamond"/>
+          <w:sz w:val="28"/>
+          <w:szCs w:val="28"/>
+          <w:highlight w:val="white"/>
+        </w:rPr>
+      </w:pPr>
+      <w:r>
+        <w:rPr>
+          <w:rtl w:val="0"/>
+        </w:rPr>
+      </w:r>
+    </w:p>
+    <w:p>
+      <w:pPr>
+        <w:rPr>
+          <w:rFonts w:ascii="EB Garamond" w:cs="EB Garamond" w:eastAsia="EB Garamond" w:hAnsi="EB Garamond"/>
+          <w:sz w:val="28"/>
+          <w:szCs w:val="28"/>
+          <w:highlight w:val="white"/>
+        </w:rPr>
+      </w:pPr>
+      <w:r>
+        <w:rPr>
+          <w:rFonts w:ascii="EB Garamond" w:cs="EB Garamond" w:eastAsia="EB Garamond" w:hAnsi="EB Garamond"/>
+          <w:sz w:val="28"/>
+          <w:szCs w:val="28"/>
+          <w:highlight w:val="white"/>
+          <w:rtl w:val="0"/>
+        </w:rPr>
+        <w:t xml:space="preserve">I have produced a small electrical diagram to illustrate the terminal connections.</w:t>
+      </w:r>
+    </w:p>
+    <w:p>
+      <w:pPr>
+        <w:rPr>
+          <w:rFonts w:ascii="EB Garamond" w:cs="EB Garamond" w:eastAsia="EB Garamond" w:hAnsi="EB Garamond"/>
+          <w:sz w:val="28"/>
+          <w:szCs w:val="28"/>
+          <w:highlight w:val="white"/>
+        </w:rPr>
+      </w:pPr>
+      <w:r>
+        <w:rPr>
+          <w:rtl w:val="0"/>
+        </w:rPr>
+      </w:r>
+    </w:p>
+    <w:p>
+      <w:pPr>
+        <w:rPr>
+          <w:rFonts w:ascii="EB Garamond" w:cs="EB Garamond" w:eastAsia="EB Garamond" w:hAnsi="EB Garamond"/>
+          <w:sz w:val="28"/>
+          <w:szCs w:val="28"/>
+          <w:highlight w:val="white"/>
+        </w:rPr>
+      </w:pPr>
+      <w:r>
+        <w:rPr>
+          <w:rFonts w:ascii="EB Garamond" w:cs="EB Garamond" w:eastAsia="EB Garamond" w:hAnsi="EB Garamond"/>
+          <w:sz w:val="28"/>
+          <w:szCs w:val="28"/>
+          <w:highlight w:val="white"/>
+        </w:rPr>
+        <w:drawing>
+          <wp:inline distB="114300" distT="114300" distL="114300" distR="114300">
+            <wp:extent cx="5731200" cy="2286000"/>
+            <wp:effectExtent b="101600" l="101600" r="101600" t="101600"/>
+            <wp:docPr id="2" name="image4.png"/>
+            <a:graphic>
+              <a:graphicData uri="http://schemas.openxmlformats.org/drawingml/2006/picture">
+                <pic:pic>
+                  <pic:nvPicPr>
+                    <pic:cNvPr id="0" name="image4.png"/>
+                    <pic:cNvPicPr preferRelativeResize="0"/>
+                  </pic:nvPicPr>
+                  <pic:blipFill>
+                    <a:blip r:embed="rId8"/>
+                    <a:srcRect b="0" l="0" r="0" t="0"/>
+                    <a:stretch>
+                      <a:fillRect/>
+                    </a:stretch>
+                  </pic:blipFill>
+                  <pic:spPr>
+                    <a:xfrm>
+                      <a:off x="0" y="0"/>
+                      <a:ext cx="5731200" cy="2286000"/>
+                    </a:xfrm>
+                    <a:prstGeom prst="rect"/>
+                    <a:ln w="101600">
+                      <a:solidFill>
+                        <a:srgbClr val="000000"/>
+                      </a:solidFill>
+                      <a:prstDash val="solid"/>
+                    </a:ln>
+                  </pic:spPr>
+                </pic:pic>
+              </a:graphicData>
+            </a:graphic>
+          </wp:inline>
+        </w:drawing>
+      </w:r>
+      <w:r>
+        <w:rPr>
+          <w:rtl w:val="0"/>
+        </w:rPr>
+      </w:r>
+    </w:p>
+    <w:p>
+      <w:pPr>
+        <w:rPr>
+          <w:rFonts w:ascii="EB Garamond" w:cs="EB Garamond" w:eastAsia="EB Garamond" w:hAnsi="EB Garamond"/>
+          <w:sz w:val="28"/>
+          <w:szCs w:val="28"/>
+          <w:highlight w:val="white"/>
+        </w:rPr>
+      </w:pPr>
+      <w:r>
+        <w:rPr>
+          <w:rtl w:val="0"/>
+        </w:rPr>
+      </w:r>
+    </w:p>
+    <w:p>
+      <w:pPr>
+        <w:rPr>
+          <w:rFonts w:ascii="EB Garamond" w:cs="EB Garamond" w:eastAsia="EB Garamond" w:hAnsi="EB Garamond"/>
+          <w:sz w:val="28"/>
+          <w:szCs w:val="28"/>
+          <w:highlight w:val="white"/>
+        </w:rPr>
+      </w:pPr>
+      <w:r>
+        <w:rPr>
+          <w:rtl w:val="0"/>
+        </w:rPr>
       </w:r>
     </w:p>
     <w:p>
@@ -744,7 +971,7 @@
           <wp:inline distB="114300" distT="114300" distL="114300" distR="114300">
             <wp:extent cx="5731200" cy="2692400"/>
             <wp:effectExtent b="101600" l="101600" r="101600" t="101600"/>
-            <wp:docPr id="2" name="image1.png"/>
+            <wp:docPr id="4" name="image1.png"/>
             <a:graphic>
               <a:graphicData uri="http://schemas.openxmlformats.org/drawingml/2006/picture">
                 <pic:pic>
@@ -753,7 +980,7 @@
                     <pic:cNvPicPr preferRelativeResize="0"/>
                   </pic:nvPicPr>
                   <pic:blipFill>
-                    <a:blip r:embed="rId7"/>
+                    <a:blip r:embed="rId9"/>
                     <a:srcRect b="0" l="0" r="0" t="0"/>
                     <a:stretch>
                       <a:fillRect/>
@@ -865,16 +1092,16 @@
           <wp:inline distB="114300" distT="114300" distL="114300" distR="114300">
             <wp:extent cx="4572000" cy="2000250"/>
             <wp:effectExtent b="25400" l="25400" r="25400" t="25400"/>
-            <wp:docPr id="3" name="image3.png"/>
+            <wp:docPr id="5" name="image2.png"/>
             <a:graphic>
               <a:graphicData uri="http://schemas.openxmlformats.org/drawingml/2006/picture">
                 <pic:pic>
                   <pic:nvPicPr>
-                    <pic:cNvPr id="0" name="image3.png"/>
+                    <pic:cNvPr id="0" name="image2.png"/>
                     <pic:cNvPicPr preferRelativeResize="0"/>
                   </pic:nvPicPr>
                   <pic:blipFill>
-                    <a:blip r:embed="rId8"/>
+                    <a:blip r:embed="rId10"/>
                     <a:srcRect b="0" l="0" r="0" t="0"/>
                     <a:stretch>
                       <a:fillRect/>
@@ -941,7 +1168,7 @@
       </w:r>
     </w:p>
     <w:sectPr>
-      <w:headerReference r:id="rId9" w:type="default"/>
+      <w:headerReference r:id="rId11" w:type="default"/>
       <w:pgSz w:h="16834" w:w="11909" w:orient="portrait"/>
       <w:pgMar w:bottom="1440" w:top="1440" w:left="1440" w:right="1440" w:header="720" w:footer="720"/>
       <w:pgNumType w:start="1"/>
@@ -961,6 +1188,17 @@
         <w:rtl w:val="0"/>
       </w:rPr>
       <w:t xml:space="preserve">Tuesday 18th November 2025</w:t>
+    </w:r>
+  </w:p>
+  <w:p>
+    <w:pPr>
+      <w:rPr/>
+    </w:pPr>
+    <w:r>
+      <w:rPr>
+        <w:rtl w:val="0"/>
+      </w:rPr>
+      <w:t xml:space="preserve">IWA</w:t>
     </w:r>
   </w:p>
 </w:hdr>

</xml_diff>